<commit_message>
fix: 1. Requirements Classification_VNS.docx
</commit_message>
<xml_diff>
--- a/BA/Part 2_Requirements Classification-20260912/Done/Manual/Artifacts/1. Requirements Classification_VNS.docx
+++ b/BA/Part 2_Requirements Classification-20260912/Done/Manual/Artifacts/1. Requirements Classification_VNS.docx
@@ -34,10 +34,7 @@
         <w:pStyle w:val="ListNumber"/>
       </w:pPr>
       <w:r>
-        <w:rPr>
-          <w:sz w:val="28"/>
-        </w:rPr>
-        <w:t>Bring all courses, deadlines and grades into the university's own platform so that the old VNS (Moodle) is not the only place students have to check: at least 70 % of the pilot courses are run fully on the new platform by the end of the spring 2027 semester.</w:t>
+        <w:t>Bring all courses, deadlines and grades into the university's own platform so that the old VNS (Moodle) is completely replaced and students no longer need to check it: at least 90 % of the pilot courses are run fully on the new platform by the end of the spring 2027 semester.</w:t>
       </w:r>
     </w:p>
     <w:p>
@@ -45,10 +42,7 @@
         <w:pStyle w:val="ListNumber"/>
       </w:pPr>
       <w:r>
-        <w:rPr>
-          <w:sz w:val="28"/>
-        </w:rPr>
-        <w:t>Keep every course discussion inside the product instead of Telegram and Discord, so that nothing is lost outside the system: during the pilot at least 60 % of course questions are asked and answered here.</w:t>
+        <w:t>Keep every course discussion inside the product instead of Telegram and Discord, so that all communication is centralized in the system with full history: during the pilot at least 95 % of course questions are asked and answered here.</w:t>
       </w:r>
     </w:p>
     <w:p>
@@ -189,10 +183,7 @@
         <w:pStyle w:val="ListBullet"/>
       </w:pPr>
       <w:r>
-        <w:rPr>
-          <w:sz w:val="28"/>
-        </w:rPr>
-        <w:t>All personal data and course content must be kept safe: role and course level access checks, hashed passwords, JWT sessions and access filtering applied before any search result or AI answer is produced (Law of Ukraine on Personal Data Protection, GDPR principles).</w:t>
+        <w:t>All personal data and course content must be kept safe: role and course level access checks, hashed passwords, JWT sessions and access filtering applied before any search result or AI answer is produced (Law of Ukraine on Personal Data Protection).</w:t>
       </w:r>
     </w:p>
     <w:p>
@@ -211,10 +202,7 @@
         <w:pStyle w:val="ListBullet"/>
       </w:pPr>
       <w:r>
-        <w:rPr>
-          <w:sz w:val="28"/>
-        </w:rPr>
-        <w:t>The product must work well on phones and be open to everyone: installable PWA, WCAG 2.2 AA, keyboard-only navigation, dark theme, Ukrainian and English languages, offline access to saved materials and flashcards.</w:t>
+        <w:t>The product must work well on phones and be open to everyone: dark theme, Ukrainian and English languages, offline access to saved materials and flashcards.</w:t>
       </w:r>
     </w:p>
     <w:p>
@@ -250,10 +238,7 @@
         <w:pStyle w:val="ListNumber"/>
       </w:pPr>
       <w:r>
-        <w:rPr>
-          <w:sz w:val="28"/>
-        </w:rPr>
-        <w:t>The dean's office is able to export a CSV list of students and lecturers, so we do not need Moodle to fill the system with users.</w:t>
+        <w:t>The dean's office will provide up-to-date CSV exports of students and lecturers for each semester in a consistent format.</w:t>
       </w:r>
     </w:p>
     <w:p>
@@ -281,10 +266,7 @@
         <w:pStyle w:val="ListNumber"/>
       </w:pPr>
       <w:r>
-        <w:rPr>
-          <w:sz w:val="28"/>
-        </w:rPr>
-        <w:t>The team has chosen a custom backend with no Moodle integration (decision of 22/09/2026), so every course, group and grade has to be entered or imported by us.</w:t>
+        <w:t>The project must be implemented as a standalone platform without reliance on the existing Moodle/VNS infrastructure.</w:t>
       </w:r>
     </w:p>
     <w:p>
@@ -292,10 +274,7 @@
         <w:pStyle w:val="ListNumber"/>
       </w:pPr>
       <w:r>
-        <w:rPr>
-          <w:sz w:val="28"/>
-        </w:rPr>
-        <w:t>The work is a demonstration study case done by five students and due on 31/01/2027 under Ukrainian personal data law and academic integrity rules.</w:t>
+        <w:t>The work is a demonstration study case done by five students and due on 20/12/2026 under Ukrainian personal data law and academic integrity rules.</w:t>
       </w:r>
     </w:p>
     <w:p>
@@ -312,21 +291,7 @@
         <w:pStyle w:val="ListNumber"/>
       </w:pPr>
       <w:r>
-        <w:rPr>
-          <w:sz w:val="28"/>
-        </w:rPr>
-        <w:t>The lecturer decides which AI features are switched on for a course or an assignment, and the AI must never write a finished solution for a graded task; AI-generated content is always marked.</w:t>
-      </w:r>
-    </w:p>
-    <w:p>
-      <w:pPr>
-        <w:pStyle w:val="ListNumber"/>
-      </w:pPr>
-      <w:r>
-        <w:rPr>
-          <w:sz w:val="28"/>
-        </w:rPr>
-        <w:t>XP, streaks and the reward shop must never change an official grade unless the lecturer has explicitly enabled a bonus for that course; rankings are optional and show only the top-10 and the student's own place.</w:t>
+        <w:t>BR-01: The lecturer controls AI feature availability per course/assignment. AI must not produce complete solutions for graded tasks. All AI-generated content must be clearly marked.</w:t>
       </w:r>
     </w:p>
     <w:sectPr>

</xml_diff>

<commit_message>
Update part_2 manual artifact
</commit_message>
<xml_diff>
--- a/BA/Part 2_Requirements Classification-20260912/Done/Manual/Artifacts/1. Requirements Classification_VNS.docx
+++ b/BA/Part 2_Requirements Classification-20260912/Done/Manual/Artifacts/1. Requirements Classification_VNS.docx
@@ -235,14 +235,7 @@
           <w:sz w:val="28"/>
           <w:szCs w:val="28"/>
         </w:rPr>
-        <w:t>The product must work well on phones and be open to everyone: dark theme, Ukrainian and English languages</w:t>
-      </w:r>
-      <w:r>
-        <w:rPr>
-          <w:sz w:val="28"/>
-          <w:szCs w:val="28"/>
-        </w:rPr>
-        <w:t>.</w:t>
+        <w:t>The product must work well on phones and be open to everyone: dark theme, Ukrainian and English languages.</w:t>
       </w:r>
     </w:p>
     <w:p>
@@ -404,241 +397,7 @@
           <w:szCs w:val="28"/>
           <w:lang w:val="uk-UA"/>
         </w:rPr>
-        <w:t xml:space="preserve"> </w:t>
-      </w:r>
-      <w:proofErr w:type="spellStart"/>
-      <w:r>
-        <w:rPr>
-          <w:sz w:val="28"/>
-          <w:szCs w:val="28"/>
-          <w:lang w:val="uk-UA"/>
-        </w:rPr>
-        <w:t>The</w:t>
-      </w:r>
-      <w:proofErr w:type="spellEnd"/>
-      <w:r>
-        <w:rPr>
-          <w:sz w:val="28"/>
-          <w:szCs w:val="28"/>
-          <w:lang w:val="uk-UA"/>
-        </w:rPr>
-        <w:t xml:space="preserve"> </w:t>
-      </w:r>
-      <w:proofErr w:type="spellStart"/>
-      <w:r>
-        <w:rPr>
-          <w:sz w:val="28"/>
-          <w:szCs w:val="28"/>
-          <w:lang w:val="uk-UA"/>
-        </w:rPr>
-        <w:t>lecturer</w:t>
-      </w:r>
-      <w:proofErr w:type="spellEnd"/>
-      <w:r>
-        <w:rPr>
-          <w:sz w:val="28"/>
-          <w:szCs w:val="28"/>
-          <w:lang w:val="uk-UA"/>
-        </w:rPr>
-        <w:t xml:space="preserve"> </w:t>
-      </w:r>
-      <w:proofErr w:type="spellStart"/>
-      <w:r>
-        <w:rPr>
-          <w:sz w:val="28"/>
-          <w:szCs w:val="28"/>
-          <w:lang w:val="uk-UA"/>
-        </w:rPr>
-        <w:t>enables</w:t>
-      </w:r>
-      <w:proofErr w:type="spellEnd"/>
-      <w:r>
-        <w:rPr>
-          <w:sz w:val="28"/>
-          <w:szCs w:val="28"/>
-          <w:lang w:val="uk-UA"/>
-        </w:rPr>
-        <w:t xml:space="preserve"> </w:t>
-      </w:r>
-      <w:proofErr w:type="spellStart"/>
-      <w:r>
-        <w:rPr>
-          <w:sz w:val="28"/>
-          <w:szCs w:val="28"/>
-          <w:lang w:val="uk-UA"/>
-        </w:rPr>
-        <w:t>or</w:t>
-      </w:r>
-      <w:proofErr w:type="spellEnd"/>
-      <w:r>
-        <w:rPr>
-          <w:sz w:val="28"/>
-          <w:szCs w:val="28"/>
-          <w:lang w:val="uk-UA"/>
-        </w:rPr>
-        <w:t xml:space="preserve"> </w:t>
-      </w:r>
-      <w:proofErr w:type="spellStart"/>
-      <w:r>
-        <w:rPr>
-          <w:sz w:val="28"/>
-          <w:szCs w:val="28"/>
-          <w:lang w:val="uk-UA"/>
-        </w:rPr>
-        <w:t>disables</w:t>
-      </w:r>
-      <w:proofErr w:type="spellEnd"/>
-      <w:r>
-        <w:rPr>
-          <w:sz w:val="28"/>
-          <w:szCs w:val="28"/>
-          <w:lang w:val="uk-UA"/>
-        </w:rPr>
-        <w:t xml:space="preserve"> AI </w:t>
-      </w:r>
-      <w:proofErr w:type="spellStart"/>
-      <w:r>
-        <w:rPr>
-          <w:sz w:val="28"/>
-          <w:szCs w:val="28"/>
-          <w:lang w:val="uk-UA"/>
-        </w:rPr>
-        <w:t>features</w:t>
-      </w:r>
-      <w:proofErr w:type="spellEnd"/>
-      <w:r>
-        <w:rPr>
-          <w:sz w:val="28"/>
-          <w:szCs w:val="28"/>
-          <w:lang w:val="uk-UA"/>
-        </w:rPr>
-        <w:t xml:space="preserve"> </w:t>
-      </w:r>
-      <w:proofErr w:type="spellStart"/>
-      <w:r>
-        <w:rPr>
-          <w:sz w:val="28"/>
-          <w:szCs w:val="28"/>
-          <w:lang w:val="uk-UA"/>
-        </w:rPr>
-        <w:t>per</w:t>
-      </w:r>
-      <w:proofErr w:type="spellEnd"/>
-      <w:r>
-        <w:rPr>
-          <w:sz w:val="28"/>
-          <w:szCs w:val="28"/>
-          <w:lang w:val="uk-UA"/>
-        </w:rPr>
-        <w:t xml:space="preserve"> </w:t>
-      </w:r>
-      <w:proofErr w:type="spellStart"/>
-      <w:r>
-        <w:rPr>
-          <w:sz w:val="28"/>
-          <w:szCs w:val="28"/>
-          <w:lang w:val="uk-UA"/>
-        </w:rPr>
-        <w:t>course</w:t>
-      </w:r>
-      <w:proofErr w:type="spellEnd"/>
-      <w:r>
-        <w:rPr>
-          <w:sz w:val="28"/>
-          <w:szCs w:val="28"/>
-          <w:lang w:val="uk-UA"/>
-        </w:rPr>
-        <w:t xml:space="preserve"> </w:t>
-      </w:r>
-      <w:proofErr w:type="spellStart"/>
-      <w:r>
-        <w:rPr>
-          <w:sz w:val="28"/>
-          <w:szCs w:val="28"/>
-          <w:lang w:val="uk-UA"/>
-        </w:rPr>
-        <w:t>and</w:t>
-      </w:r>
-      <w:proofErr w:type="spellEnd"/>
-      <w:r>
-        <w:rPr>
-          <w:sz w:val="28"/>
-          <w:szCs w:val="28"/>
-          <w:lang w:val="uk-UA"/>
-        </w:rPr>
-        <w:t xml:space="preserve"> </w:t>
-      </w:r>
-      <w:proofErr w:type="spellStart"/>
-      <w:r>
-        <w:rPr>
-          <w:sz w:val="28"/>
-          <w:szCs w:val="28"/>
-          <w:lang w:val="uk-UA"/>
-        </w:rPr>
-        <w:t>per</w:t>
-      </w:r>
-      <w:proofErr w:type="spellEnd"/>
-      <w:r>
-        <w:rPr>
-          <w:sz w:val="28"/>
-          <w:szCs w:val="28"/>
-          <w:lang w:val="uk-UA"/>
-        </w:rPr>
-        <w:t xml:space="preserve"> </w:t>
-      </w:r>
-      <w:proofErr w:type="spellStart"/>
-      <w:r>
-        <w:rPr>
-          <w:sz w:val="28"/>
-          <w:szCs w:val="28"/>
-          <w:lang w:val="uk-UA"/>
-        </w:rPr>
-        <w:t>assignment</w:t>
-      </w:r>
-      <w:proofErr w:type="spellEnd"/>
-      <w:r>
-        <w:rPr>
-          <w:sz w:val="28"/>
-          <w:szCs w:val="28"/>
-          <w:lang w:val="uk-UA"/>
-        </w:rPr>
-        <w:t>. (</w:t>
-      </w:r>
-      <w:proofErr w:type="spellStart"/>
-      <w:r>
-        <w:rPr>
-          <w:sz w:val="28"/>
-          <w:szCs w:val="28"/>
-          <w:lang w:val="uk-UA"/>
-        </w:rPr>
-        <w:t>Default</w:t>
-      </w:r>
-      <w:proofErr w:type="spellEnd"/>
-      <w:r>
-        <w:rPr>
-          <w:sz w:val="28"/>
-          <w:szCs w:val="28"/>
-          <w:lang w:val="uk-UA"/>
-        </w:rPr>
-        <w:t xml:space="preserve">: </w:t>
-      </w:r>
-      <w:proofErr w:type="spellStart"/>
-      <w:r>
-        <w:rPr>
-          <w:sz w:val="28"/>
-          <w:szCs w:val="28"/>
-          <w:lang w:val="uk-UA"/>
-        </w:rPr>
-        <w:t>disabled</w:t>
-      </w:r>
-      <w:proofErr w:type="spellEnd"/>
-      <w:r>
-        <w:rPr>
-          <w:sz w:val="28"/>
-          <w:szCs w:val="28"/>
-          <w:lang w:val="uk-UA"/>
-        </w:rPr>
-        <w:t>)</w:t>
+        <w:t xml:space="preserve"> The lecturer enables or disables AI features per course and per assignment. (Default: disabled)</w:t>
       </w:r>
     </w:p>
     <w:p>
@@ -666,151 +425,7 @@
           <w:szCs w:val="28"/>
           <w:lang w:val="uk-UA"/>
         </w:rPr>
-        <w:t xml:space="preserve"> </w:t>
-      </w:r>
-      <w:proofErr w:type="spellStart"/>
-      <w:r>
-        <w:rPr>
-          <w:sz w:val="28"/>
-          <w:szCs w:val="28"/>
-          <w:lang w:val="uk-UA"/>
-        </w:rPr>
-        <w:t>For</w:t>
-      </w:r>
-      <w:proofErr w:type="spellEnd"/>
-      <w:r>
-        <w:rPr>
-          <w:sz w:val="28"/>
-          <w:szCs w:val="28"/>
-          <w:lang w:val="uk-UA"/>
-        </w:rPr>
-        <w:t xml:space="preserve"> </w:t>
-      </w:r>
-      <w:proofErr w:type="spellStart"/>
-      <w:r>
-        <w:rPr>
-          <w:sz w:val="28"/>
-          <w:szCs w:val="28"/>
-          <w:lang w:val="uk-UA"/>
-        </w:rPr>
-        <w:t>graded</w:t>
-      </w:r>
-      <w:proofErr w:type="spellEnd"/>
-      <w:r>
-        <w:rPr>
-          <w:sz w:val="28"/>
-          <w:szCs w:val="28"/>
-          <w:lang w:val="uk-UA"/>
-        </w:rPr>
-        <w:t xml:space="preserve"> </w:t>
-      </w:r>
-      <w:proofErr w:type="spellStart"/>
-      <w:r>
-        <w:rPr>
-          <w:sz w:val="28"/>
-          <w:szCs w:val="28"/>
-          <w:lang w:val="uk-UA"/>
-        </w:rPr>
-        <w:t>tasks</w:t>
-      </w:r>
-      <w:proofErr w:type="spellEnd"/>
-      <w:r>
-        <w:rPr>
-          <w:sz w:val="28"/>
-          <w:szCs w:val="28"/>
-          <w:lang w:val="uk-UA"/>
-        </w:rPr>
-        <w:t xml:space="preserve">, AI </w:t>
-      </w:r>
-      <w:proofErr w:type="spellStart"/>
-      <w:r>
-        <w:rPr>
-          <w:sz w:val="28"/>
-          <w:szCs w:val="28"/>
-          <w:lang w:val="uk-UA"/>
-        </w:rPr>
-        <w:t>shall</w:t>
-      </w:r>
-      <w:proofErr w:type="spellEnd"/>
-      <w:r>
-        <w:rPr>
-          <w:sz w:val="28"/>
-          <w:szCs w:val="28"/>
-          <w:lang w:val="uk-UA"/>
-        </w:rPr>
-        <w:t xml:space="preserve"> </w:t>
-      </w:r>
-      <w:proofErr w:type="spellStart"/>
-      <w:r>
-        <w:rPr>
-          <w:sz w:val="28"/>
-          <w:szCs w:val="28"/>
-          <w:lang w:val="uk-UA"/>
-        </w:rPr>
-        <w:t>not</w:t>
-      </w:r>
-      <w:proofErr w:type="spellEnd"/>
-      <w:r>
-        <w:rPr>
-          <w:sz w:val="28"/>
-          <w:szCs w:val="28"/>
-          <w:lang w:val="uk-UA"/>
-        </w:rPr>
-        <w:t xml:space="preserve"> </w:t>
-      </w:r>
-      <w:proofErr w:type="spellStart"/>
-      <w:r>
-        <w:rPr>
-          <w:sz w:val="28"/>
-          <w:szCs w:val="28"/>
-          <w:lang w:val="uk-UA"/>
-        </w:rPr>
-        <w:t>generate</w:t>
-      </w:r>
-      <w:proofErr w:type="spellEnd"/>
-      <w:r>
-        <w:rPr>
-          <w:sz w:val="28"/>
-          <w:szCs w:val="28"/>
-          <w:lang w:val="uk-UA"/>
-        </w:rPr>
-        <w:t xml:space="preserve"> </w:t>
-      </w:r>
-      <w:proofErr w:type="spellStart"/>
-      <w:r>
-        <w:rPr>
-          <w:sz w:val="28"/>
-          <w:szCs w:val="28"/>
-          <w:lang w:val="uk-UA"/>
-        </w:rPr>
-        <w:t>complete</w:t>
-      </w:r>
-      <w:proofErr w:type="spellEnd"/>
-      <w:r>
-        <w:rPr>
-          <w:sz w:val="28"/>
-          <w:szCs w:val="28"/>
-          <w:lang w:val="uk-UA"/>
-        </w:rPr>
-        <w:t xml:space="preserve"> </w:t>
-      </w:r>
-      <w:proofErr w:type="spellStart"/>
-      <w:r>
-        <w:rPr>
-          <w:sz w:val="28"/>
-          <w:szCs w:val="28"/>
-          <w:lang w:val="uk-UA"/>
-        </w:rPr>
-        <w:t>solutions</w:t>
-      </w:r>
-      <w:proofErr w:type="spellEnd"/>
-      <w:r>
-        <w:rPr>
-          <w:sz w:val="28"/>
-          <w:szCs w:val="28"/>
-          <w:lang w:val="uk-UA"/>
-        </w:rPr>
-        <w:t>;</w:t>
+        <w:t xml:space="preserve"> For graded tasks, AI shall not generate complete solutions;</w:t>
       </w:r>
       <w:r>
         <w:rPr>
@@ -819,88 +434,14 @@
         </w:rPr>
         <w:t xml:space="preserve"> </w:t>
       </w:r>
-      <w:proofErr w:type="spellStart"/>
       <w:r>
         <w:rPr>
           <w:sz w:val="28"/>
           <w:szCs w:val="28"/>
           <w:lang w:val="uk-UA"/>
         </w:rPr>
-        <w:t>it</w:t>
+        <w:t>it may only give hints</w:t>
       </w:r>
-      <w:proofErr w:type="spellEnd"/>
-      <w:r>
-        <w:rPr>
-          <w:sz w:val="28"/>
-          <w:szCs w:val="28"/>
-          <w:lang w:val="uk-UA"/>
-        </w:rPr>
-        <w:t xml:space="preserve"> </w:t>
-      </w:r>
-      <w:proofErr w:type="spellStart"/>
-      <w:r>
-        <w:rPr>
-          <w:sz w:val="28"/>
-          <w:szCs w:val="28"/>
-          <w:lang w:val="uk-UA"/>
-        </w:rPr>
-        <w:t>may</w:t>
-      </w:r>
-      <w:proofErr w:type="spellEnd"/>
-      <w:r>
-        <w:rPr>
-          <w:sz w:val="28"/>
-          <w:szCs w:val="28"/>
-          <w:lang w:val="uk-UA"/>
-        </w:rPr>
-        <w:t xml:space="preserve"> </w:t>
-      </w:r>
-      <w:proofErr w:type="spellStart"/>
-      <w:r>
-        <w:rPr>
-          <w:sz w:val="28"/>
-          <w:szCs w:val="28"/>
-          <w:lang w:val="uk-UA"/>
-        </w:rPr>
-        <w:t>only</w:t>
-      </w:r>
-      <w:proofErr w:type="spellEnd"/>
-      <w:r>
-        <w:rPr>
-          <w:sz w:val="28"/>
-          <w:szCs w:val="28"/>
-          <w:lang w:val="uk-UA"/>
-        </w:rPr>
-        <w:t xml:space="preserve"> </w:t>
-      </w:r>
-      <w:proofErr w:type="spellStart"/>
-      <w:r>
-        <w:rPr>
-          <w:sz w:val="28"/>
-          <w:szCs w:val="28"/>
-          <w:lang w:val="uk-UA"/>
-        </w:rPr>
-        <w:t>give</w:t>
-      </w:r>
-      <w:proofErr w:type="spellEnd"/>
-      <w:r>
-        <w:rPr>
-          <w:sz w:val="28"/>
-          <w:szCs w:val="28"/>
-          <w:lang w:val="uk-UA"/>
-        </w:rPr>
-        <w:t xml:space="preserve"> </w:t>
-      </w:r>
-      <w:proofErr w:type="spellStart"/>
-      <w:r>
-        <w:rPr>
-          <w:sz w:val="28"/>
-          <w:szCs w:val="28"/>
-          <w:lang w:val="uk-UA"/>
-        </w:rPr>
-        <w:t>hints</w:t>
-      </w:r>
-      <w:proofErr w:type="spellEnd"/>
       <w:r>
         <w:rPr>
           <w:sz w:val="28"/>
@@ -914,18 +455,8 @@
           <w:szCs w:val="28"/>
           <w:lang w:val="uk-UA"/>
         </w:rPr>
-        <w:t xml:space="preserve"> </w:t>
+        <w:t xml:space="preserve"> explanations</w:t>
       </w:r>
-      <w:proofErr w:type="spellStart"/>
-      <w:r>
-        <w:rPr>
-          <w:sz w:val="28"/>
-          <w:szCs w:val="28"/>
-          <w:lang w:val="uk-UA"/>
-        </w:rPr>
-        <w:t>explanations</w:t>
-      </w:r>
-      <w:proofErr w:type="spellEnd"/>
       <w:r>
         <w:rPr>
           <w:sz w:val="28"/>
@@ -939,40 +470,14 @@
           <w:szCs w:val="28"/>
           <w:lang w:val="uk-UA"/>
         </w:rPr>
-        <w:t xml:space="preserve"> </w:t>
+        <w:t xml:space="preserve"> feedback</w:t>
       </w:r>
-      <w:proofErr w:type="spellStart"/>
-      <w:r>
-        <w:rPr>
-          <w:sz w:val="28"/>
-          <w:szCs w:val="28"/>
-          <w:lang w:val="uk-UA"/>
-        </w:rPr>
-        <w:t>feedback</w:t>
-      </w:r>
-      <w:proofErr w:type="spellEnd"/>
       <w:r>
         <w:rPr>
           <w:sz w:val="28"/>
           <w:szCs w:val="28"/>
         </w:rPr>
-        <w:t xml:space="preserve">(after task </w:t>
-      </w:r>
-      <w:proofErr w:type="spellStart"/>
-      <w:r>
-        <w:rPr>
-          <w:sz w:val="28"/>
-          <w:szCs w:val="28"/>
-        </w:rPr>
-        <w:t>submition</w:t>
-      </w:r>
-      <w:proofErr w:type="spellEnd"/>
-      <w:r>
-        <w:rPr>
-          <w:sz w:val="28"/>
-          <w:szCs w:val="28"/>
-        </w:rPr>
-        <w:t>)</w:t>
+        <w:t>(after task submition)</w:t>
       </w:r>
       <w:r>
         <w:rPr>
@@ -998,7 +503,16 @@
           <w:sz w:val="28"/>
           <w:szCs w:val="28"/>
         </w:rPr>
-        <w:t>BR-04</w:t>
+        <w:t>BR-0</w:t>
+      </w:r>
+      <w:r>
+        <w:rPr>
+          <w:b/>
+          <w:bCs/>
+          <w:sz w:val="28"/>
+          <w:szCs w:val="28"/>
+        </w:rPr>
+        <w:t>3</w:t>
       </w:r>
       <w:r>
         <w:rPr>
@@ -1023,7 +537,16 @@
           <w:sz w:val="28"/>
           <w:szCs w:val="28"/>
         </w:rPr>
-        <w:t>BR-05</w:t>
+        <w:t>BR-0</w:t>
+      </w:r>
+      <w:r>
+        <w:rPr>
+          <w:b/>
+          <w:bCs/>
+          <w:sz w:val="28"/>
+          <w:szCs w:val="28"/>
+        </w:rPr>
+        <w:t>4</w:t>
       </w:r>
       <w:r>
         <w:rPr>
@@ -2162,6 +1685,7 @@
   <w:style w:type="character" w:default="1" w:styleId="a2">
     <w:name w:val="Default Paragraph Font"/>
     <w:uiPriority w:val="1"/>
+    <w:semiHidden/>
     <w:unhideWhenUsed/>
   </w:style>
   <w:style w:type="table" w:default="1" w:styleId="a3">

</xml_diff>